<commit_message>
feat(fire): the fire-safety card says whether other firms (tenants, contractors) work on the client's premises, stored as has_third_parties, false by default, and decision 9 then adds their quarterly control by the coordinator and the technician, as the item after the first in its schedule, the letters after it moving up by one, and as a row after the quarterly one in its grid, marked in March, June, September and December; the merge data carries it as fire.hasThirdParties, the local seed sets it at every other client, and ADR 019 records it
</commit_message>
<xml_diff>
--- a/packages/document-engine/templates/fire/1.9_fire_decision_control.docx
+++ b/packages/document-engine/templates/fire/1.9_fire_decision_control.docx
@@ -343,6 +343,28 @@
         </w:rPr>
       </w:pPr>
       <w:r>
+        <w:t>{{#fire.hasThirdParties}}</w:t>
+      </w:r>
+    </w:p>
+    <w:p>
+      <w:pPr>
+        <w:pStyle w:val="Normal"/>
+        <w:keepNext w:val="false"/>
+        <w:pageBreakBefore w:val="false"/>
+        <w:widowControl/>
+        <w:numPr>
+          <w:ilvl w:val="0"/>
+          <w:numId w:val="0"/>
+        </w:numPr>
+        <w:spacing w:before="0" w:after="40"/>
+        <w:ind w:hanging="360" w:left="720"/>
+        <w:jc w:val="left"/>
+        <w:rPr>
+          <w:rFonts w:ascii="Arial" w:hAnsi="Arial" w:cs="Arial"/>
+          <w:lang w:val="ro-RO"/>
+        </w:rPr>
+      </w:pPr>
+      <w:r>
         <w:rPr>
           <w:rFonts w:eastAsia="Arial" w:cs="Arial" w:ascii="Arial" w:hAnsi="Arial"/>
           <w:b/>
@@ -355,6 +377,76 @@
           <w:lang w:val="ro-RO"/>
         </w:rPr>
         <w:t>b)</w:t>
+      </w:r>
+      <w:r>
+        <w:rPr>
+          <w:rFonts w:eastAsia="Arial" w:cs="Arial" w:ascii="Arial" w:hAnsi="Arial"/>
+          <w:b w:val="false"/>
+          <w:i w:val="false"/>
+          <w:color w:val="auto"/>
+          <w:spacing w:val="0"/>
+          <w:w w:val="100"/>
+          <w:sz w:val="20"/>
+          <w:szCs w:val="20"/>
+          <w:lang w:val="ro-RO"/>
+        </w:rPr>
+        <w:tab/>
+        <w:t>coordonatorul privind apărarea împotriva incendiilor și cadrul tehnic – trimestrial, în lunile martie, iunie, septembrie și decembrie, la persoanele juridice care desfășoară activități în spațiile {{client.legalName}};</w:t>
+      </w:r>
+    </w:p>
+    <w:p>
+      <w:pPr>
+        <w:pStyle w:val="Normal"/>
+        <w:keepNext w:val="false"/>
+        <w:pageBreakBefore w:val="false"/>
+        <w:widowControl/>
+        <w:numPr>
+          <w:ilvl w:val="0"/>
+          <w:numId w:val="0"/>
+        </w:numPr>
+        <w:spacing w:before="0" w:after="40"/>
+        <w:ind w:hanging="360" w:left="720"/>
+        <w:jc w:val="left"/>
+        <w:rPr>
+          <w:rFonts w:ascii="Arial" w:hAnsi="Arial" w:cs="Arial"/>
+          <w:lang w:val="ro-RO"/>
+        </w:rPr>
+      </w:pPr>
+      <w:r>
+        <w:t>{{/fire.hasThirdParties}}</w:t>
+      </w:r>
+    </w:p>
+    <w:p>
+      <w:pPr>
+        <w:pStyle w:val="Normal"/>
+        <w:keepNext w:val="false"/>
+        <w:pageBreakBefore w:val="false"/>
+        <w:widowControl/>
+        <w:numPr>
+          <w:ilvl w:val="0"/>
+          <w:numId w:val="0"/>
+        </w:numPr>
+        <w:spacing w:before="0" w:after="40"/>
+        <w:ind w:hanging="360" w:left="720"/>
+        <w:jc w:val="left"/>
+        <w:rPr>
+          <w:rFonts w:ascii="Arial" w:hAnsi="Arial" w:cs="Arial"/>
+          <w:lang w:val="ro-RO"/>
+        </w:rPr>
+      </w:pPr>
+      <w:r>
+        <w:rPr>
+          <w:rFonts w:eastAsia="Arial" w:cs="Arial" w:ascii="Arial" w:hAnsi="Arial"/>
+          <w:b/>
+          <w:i w:val="false"/>
+          <w:color w:val="auto"/>
+          <w:spacing w:val="0"/>
+          <w:w w:val="100"/>
+          <w:sz w:val="20"/>
+          <w:szCs w:val="20"/>
+          <w:lang w:val="ro-RO"/>
+        </w:rPr>
+        <w:t>{{#fire.hasThirdParties}}c){{/fire.hasThirdParties}}{{^fire.hasThirdParties}}b){{/fire.hasThirdParties}}</w:t>
       </w:r>
       <w:r>
         <w:rPr>
@@ -402,7 +494,7 @@
           <w:szCs w:val="20"/>
           <w:lang w:val="ro-RO"/>
         </w:rPr>
-        <w:t>c)</w:t>
+        <w:t>{{#fire.hasThirdParties}}d){{/fire.hasThirdParties}}{{^fire.hasThirdParties}}c){{/fire.hasThirdParties}}</w:t>
       </w:r>
       <w:r>
         <w:rPr>
@@ -450,7 +542,7 @@
           <w:szCs w:val="20"/>
           <w:lang w:val="ro-RO"/>
         </w:rPr>
-        <w:t>d)</w:t>
+        <w:t>{{#fire.hasThirdParties}}e){{/fire.hasThirdParties}}{{^fire.hasThirdParties}}d){{/fire.hasThirdParties}}</w:t>
       </w:r>
       <w:r>
         <w:rPr>
@@ -498,7 +590,7 @@
           <w:szCs w:val="20"/>
           <w:lang w:val="ro-RO"/>
         </w:rPr>
-        <w:t>e)</w:t>
+        <w:t>{{#fire.hasThirdParties}}f){{/fire.hasThirdParties}}{{^fire.hasThirdParties}}e){{/fire.hasThirdParties}}</w:t>
       </w:r>
       <w:r>
         <w:rPr>
@@ -3174,6 +3266,685 @@
                 <w:lang w:val="ro-RO"/>
               </w:rPr>
               <w:t>X</w:t>
+            </w:r>
+          </w:p>
+        </w:tc>
+      </w:tr>
+      <w:tr>
+        <w:trPr/>
+        <w:tc>
+          <w:tcPr>
+            <w:tcW w:w="1837" w:type="dxa"/>
+            <w:tcBorders>
+              <w:left w:val="single" w:sz="4" w:space="0" w:color="000000"/>
+              <w:bottom w:val="single" w:sz="4" w:space="0" w:color="000000"/>
+            </w:tcBorders>
+            <w:vAlign w:val="center"/>
+          </w:tcPr>
+          <w:p>
+            <w:pPr>
+              <w:pStyle w:val="TableContents"/>
+              <w:keepNext w:val="true"/>
+              <w:widowControl/>
+              <w:spacing w:before="0" w:after="0"/>
+              <w:ind w:hanging="0" w:left="0"/>
+              <w:jc w:val="left"/>
+              <w:rPr>
+                <w:rFonts w:ascii="Arial" w:hAnsi="Arial" w:eastAsia="Arial" w:cs="Arial"/>
+                <w:b w:val="false"/>
+                <w:i w:val="false"/>
+                <w:color w:val="auto"/>
+                <w:spacing w:val="0"/>
+                <w:w w:val="100"/>
+                <w:sz w:val="16"/>
+                <w:szCs w:val="16"/>
+                <w:lang w:val="ro-RO"/>
+              </w:rPr>
+            </w:pPr>
+            <w:r>
+              <w:rPr>
+                <w:rFonts w:eastAsia="Arial" w:cs="Arial" w:ascii="Arial" w:hAnsi="Arial"/>
+                <w:b w:val="false"/>
+                <w:i w:val="false"/>
+                <w:color w:val="auto"/>
+                <w:spacing w:val="0"/>
+                <w:w w:val="100"/>
+                <w:sz w:val="16"/>
+                <w:szCs w:val="16"/>
+                <w:lang w:val="ro-RO"/>
+              </w:rPr>
+              <w:t>{{#fire.hasThirdParties}}Coordonatorul privind apărarea împotriva incendiilor și cadrul tehnic</w:t>
+            </w:r>
+          </w:p>
+        </w:tc>
+        <w:tc>
+          <w:tcPr>
+            <w:tcW w:w="1365" w:type="dxa"/>
+            <w:tcBorders>
+              <w:left w:val="single" w:sz="4" w:space="0" w:color="000000"/>
+              <w:bottom w:val="single" w:sz="4" w:space="0" w:color="000000"/>
+            </w:tcBorders>
+            <w:vAlign w:val="center"/>
+          </w:tcPr>
+          <w:p>
+            <w:pPr>
+              <w:pStyle w:val="TableContents"/>
+              <w:keepNext w:val="false"/>
+              <w:widowControl/>
+              <w:spacing w:before="0" w:after="0"/>
+              <w:ind w:hanging="0" w:left="0"/>
+              <w:jc w:val="center"/>
+              <w:rPr>
+                <w:rFonts w:ascii="Arial" w:hAnsi="Arial" w:eastAsia="Arial" w:cs="Arial"/>
+                <w:b w:val="false"/>
+                <w:i w:val="false"/>
+                <w:color w:val="auto"/>
+                <w:spacing w:val="0"/>
+                <w:w w:val="100"/>
+                <w:sz w:val="16"/>
+                <w:szCs w:val="16"/>
+                <w:lang w:val="ro-RO"/>
+              </w:rPr>
+            </w:pPr>
+            <w:r>
+              <w:rPr>
+                <w:rFonts w:eastAsia="Arial" w:cs="Arial" w:ascii="Arial" w:hAnsi="Arial"/>
+                <w:b w:val="false"/>
+                <w:i w:val="false"/>
+                <w:color w:val="auto"/>
+                <w:spacing w:val="0"/>
+                <w:w w:val="100"/>
+                <w:sz w:val="16"/>
+                <w:szCs w:val="16"/>
+                <w:lang w:val="ro-RO"/>
+              </w:rPr>
+              <w:t>TRIMESTRIAL</w:t>
+            </w:r>
+          </w:p>
+        </w:tc>
+        <w:tc>
+          <w:tcPr>
+            <w:tcW w:w="1365" w:type="dxa"/>
+            <w:tcBorders>
+              <w:left w:val="single" w:sz="4" w:space="0" w:color="000000"/>
+              <w:bottom w:val="single" w:sz="4" w:space="0" w:color="000000"/>
+            </w:tcBorders>
+            <w:vAlign w:val="center"/>
+          </w:tcPr>
+          <w:p>
+            <w:pPr>
+              <w:pStyle w:val="TableContents"/>
+              <w:keepNext w:val="false"/>
+              <w:widowControl/>
+              <w:spacing w:before="0" w:after="0"/>
+              <w:ind w:hanging="0" w:left="0"/>
+              <w:jc w:val="left"/>
+              <w:rPr>
+                <w:rFonts w:ascii="Arial" w:hAnsi="Arial" w:eastAsia="Arial" w:cs="Arial"/>
+                <w:b w:val="false"/>
+                <w:i w:val="false"/>
+                <w:color w:val="auto"/>
+                <w:spacing w:val="0"/>
+                <w:w w:val="100"/>
+                <w:sz w:val="16"/>
+                <w:szCs w:val="16"/>
+                <w:lang w:val="ro-RO"/>
+              </w:rPr>
+            </w:pPr>
+            <w:r>
+              <w:rPr>
+                <w:rFonts w:eastAsia="Arial" w:cs="Arial" w:ascii="Arial" w:hAnsi="Arial"/>
+                <w:b w:val="false"/>
+                <w:i w:val="false"/>
+                <w:color w:val="auto"/>
+                <w:spacing w:val="0"/>
+                <w:w w:val="100"/>
+                <w:sz w:val="16"/>
+                <w:szCs w:val="16"/>
+                <w:lang w:val="ro-RO"/>
+              </w:rPr>
+              <w:t>La persoanele juridice care desfășoară activități în perimetru</w:t>
+            </w:r>
+          </w:p>
+        </w:tc>
+        <w:tc>
+          <w:tcPr>
+            <w:tcW w:w="399" w:type="dxa"/>
+            <w:tcBorders>
+              <w:left w:val="single" w:sz="4" w:space="0" w:color="000000"/>
+              <w:bottom w:val="single" w:sz="4" w:space="0" w:color="000000"/>
+            </w:tcBorders>
+            <w:vAlign w:val="center"/>
+          </w:tcPr>
+          <w:p>
+            <w:pPr>
+              <w:pStyle w:val="TableContents"/>
+              <w:keepNext w:val="false"/>
+              <w:widowControl/>
+              <w:spacing w:before="0" w:after="0"/>
+              <w:ind w:hanging="0" w:left="0"/>
+              <w:jc w:val="center"/>
+              <w:rPr>
+                <w:rFonts w:ascii="Arial" w:hAnsi="Arial" w:eastAsia="Arial" w:cs="Arial"/>
+                <w:b w:val="false"/>
+                <w:i w:val="false"/>
+                <w:color w:val="auto"/>
+                <w:spacing w:val="0"/>
+                <w:w w:val="100"/>
+                <w:sz w:val="16"/>
+                <w:szCs w:val="16"/>
+                <w:lang w:val="ro-RO"/>
+              </w:rPr>
+            </w:pPr>
+            <w:r>
+              <w:rPr>
+                <w:rFonts w:eastAsia="Arial" w:cs="Arial" w:ascii="Arial" w:hAnsi="Arial"/>
+                <w:b w:val="false"/>
+                <w:i w:val="false"/>
+                <w:color w:val="auto"/>
+                <w:spacing w:val="0"/>
+                <w:w w:val="100"/>
+                <w:sz w:val="16"/>
+                <w:szCs w:val="16"/>
+                <w:lang w:val="ro-RO"/>
+              </w:rPr>
+              <w:t>–</w:t>
+            </w:r>
+          </w:p>
+        </w:tc>
+        <w:tc>
+          <w:tcPr>
+            <w:tcW w:w="399" w:type="dxa"/>
+            <w:tcBorders>
+              <w:left w:val="single" w:sz="4" w:space="0" w:color="000000"/>
+              <w:bottom w:val="single" w:sz="4" w:space="0" w:color="000000"/>
+            </w:tcBorders>
+            <w:vAlign w:val="center"/>
+          </w:tcPr>
+          <w:p>
+            <w:pPr>
+              <w:pStyle w:val="TableContents"/>
+              <w:keepNext w:val="false"/>
+              <w:widowControl/>
+              <w:spacing w:before="0" w:after="0"/>
+              <w:ind w:hanging="0" w:left="0"/>
+              <w:jc w:val="center"/>
+              <w:rPr>
+                <w:rFonts w:ascii="Arial" w:hAnsi="Arial" w:eastAsia="Arial" w:cs="Arial"/>
+                <w:b w:val="false"/>
+                <w:i w:val="false"/>
+                <w:color w:val="auto"/>
+                <w:spacing w:val="0"/>
+                <w:w w:val="100"/>
+                <w:sz w:val="16"/>
+                <w:szCs w:val="16"/>
+                <w:lang w:val="ro-RO"/>
+              </w:rPr>
+            </w:pPr>
+            <w:r>
+              <w:rPr>
+                <w:rFonts w:eastAsia="Arial" w:cs="Arial" w:ascii="Arial" w:hAnsi="Arial"/>
+                <w:b w:val="false"/>
+                <w:i w:val="false"/>
+                <w:color w:val="auto"/>
+                <w:spacing w:val="0"/>
+                <w:w w:val="100"/>
+                <w:sz w:val="16"/>
+                <w:szCs w:val="16"/>
+                <w:lang w:val="ro-RO"/>
+              </w:rPr>
+              <w:t>–</w:t>
+            </w:r>
+          </w:p>
+        </w:tc>
+        <w:tc>
+          <w:tcPr>
+            <w:tcW w:w="399" w:type="dxa"/>
+            <w:tcBorders>
+              <w:left w:val="single" w:sz="4" w:space="0" w:color="000000"/>
+              <w:bottom w:val="single" w:sz="4" w:space="0" w:color="000000"/>
+            </w:tcBorders>
+            <w:vAlign w:val="center"/>
+          </w:tcPr>
+          <w:p>
+            <w:pPr>
+              <w:pStyle w:val="TableContents"/>
+              <w:keepNext w:val="false"/>
+              <w:widowControl/>
+              <w:spacing w:before="0" w:after="0"/>
+              <w:ind w:hanging="0" w:left="0"/>
+              <w:jc w:val="center"/>
+              <w:rPr>
+                <w:rFonts w:ascii="Arial" w:hAnsi="Arial" w:eastAsia="Arial" w:cs="Arial"/>
+                <w:b w:val="false"/>
+                <w:i w:val="false"/>
+                <w:color w:val="auto"/>
+                <w:spacing w:val="0"/>
+                <w:w w:val="100"/>
+                <w:sz w:val="16"/>
+                <w:szCs w:val="16"/>
+                <w:lang w:val="ro-RO"/>
+              </w:rPr>
+            </w:pPr>
+            <w:r>
+              <w:rPr>
+                <w:rFonts w:eastAsia="Arial" w:cs="Arial" w:ascii="Arial" w:hAnsi="Arial"/>
+                <w:b w:val="false"/>
+                <w:i w:val="false"/>
+                <w:color w:val="auto"/>
+                <w:spacing w:val="0"/>
+                <w:w w:val="100"/>
+                <w:sz w:val="16"/>
+                <w:szCs w:val="16"/>
+                <w:lang w:val="ro-RO"/>
+              </w:rPr>
+              <w:t>X</w:t>
+            </w:r>
+          </w:p>
+        </w:tc>
+        <w:tc>
+          <w:tcPr>
+            <w:tcW w:w="399" w:type="dxa"/>
+            <w:tcBorders>
+              <w:left w:val="single" w:sz="4" w:space="0" w:color="000000"/>
+              <w:bottom w:val="single" w:sz="4" w:space="0" w:color="000000"/>
+            </w:tcBorders>
+            <w:vAlign w:val="center"/>
+          </w:tcPr>
+          <w:p>
+            <w:pPr>
+              <w:pStyle w:val="TableContents"/>
+              <w:keepNext w:val="false"/>
+              <w:widowControl/>
+              <w:spacing w:before="0" w:after="0"/>
+              <w:ind w:hanging="0" w:left="0"/>
+              <w:jc w:val="center"/>
+              <w:rPr>
+                <w:rFonts w:ascii="Arial" w:hAnsi="Arial" w:eastAsia="Arial" w:cs="Arial"/>
+                <w:b w:val="false"/>
+                <w:i w:val="false"/>
+                <w:color w:val="auto"/>
+                <w:spacing w:val="0"/>
+                <w:w w:val="100"/>
+                <w:sz w:val="16"/>
+                <w:szCs w:val="16"/>
+                <w:lang w:val="ro-RO"/>
+              </w:rPr>
+            </w:pPr>
+            <w:r>
+              <w:rPr>
+                <w:rFonts w:eastAsia="Arial" w:cs="Arial" w:ascii="Arial" w:hAnsi="Arial"/>
+                <w:b w:val="false"/>
+                <w:i w:val="false"/>
+                <w:color w:val="auto"/>
+                <w:spacing w:val="0"/>
+                <w:w w:val="100"/>
+                <w:sz w:val="16"/>
+                <w:szCs w:val="16"/>
+                <w:lang w:val="ro-RO"/>
+              </w:rPr>
+              <w:t>–</w:t>
+            </w:r>
+          </w:p>
+        </w:tc>
+        <w:tc>
+          <w:tcPr>
+            <w:tcW w:w="399" w:type="dxa"/>
+            <w:tcBorders>
+              <w:left w:val="single" w:sz="4" w:space="0" w:color="000000"/>
+              <w:bottom w:val="single" w:sz="4" w:space="0" w:color="000000"/>
+            </w:tcBorders>
+            <w:vAlign w:val="center"/>
+          </w:tcPr>
+          <w:p>
+            <w:pPr>
+              <w:pStyle w:val="TableContents"/>
+              <w:keepNext w:val="false"/>
+              <w:widowControl/>
+              <w:spacing w:before="0" w:after="0"/>
+              <w:ind w:hanging="0" w:left="0"/>
+              <w:jc w:val="center"/>
+              <w:rPr>
+                <w:rFonts w:ascii="Arial" w:hAnsi="Arial" w:eastAsia="Arial" w:cs="Arial"/>
+                <w:b w:val="false"/>
+                <w:i w:val="false"/>
+                <w:color w:val="auto"/>
+                <w:spacing w:val="0"/>
+                <w:w w:val="100"/>
+                <w:sz w:val="16"/>
+                <w:szCs w:val="16"/>
+                <w:lang w:val="ro-RO"/>
+              </w:rPr>
+            </w:pPr>
+            <w:r>
+              <w:rPr>
+                <w:rFonts w:eastAsia="Arial" w:cs="Arial" w:ascii="Arial" w:hAnsi="Arial"/>
+                <w:b w:val="false"/>
+                <w:i w:val="false"/>
+                <w:color w:val="auto"/>
+                <w:spacing w:val="0"/>
+                <w:w w:val="100"/>
+                <w:sz w:val="16"/>
+                <w:szCs w:val="16"/>
+                <w:lang w:val="ro-RO"/>
+              </w:rPr>
+              <w:t>–</w:t>
+            </w:r>
+          </w:p>
+        </w:tc>
+        <w:tc>
+          <w:tcPr>
+            <w:tcW w:w="398" w:type="dxa"/>
+            <w:tcBorders>
+              <w:left w:val="single" w:sz="4" w:space="0" w:color="000000"/>
+              <w:bottom w:val="single" w:sz="4" w:space="0" w:color="000000"/>
+            </w:tcBorders>
+            <w:vAlign w:val="center"/>
+          </w:tcPr>
+          <w:p>
+            <w:pPr>
+              <w:pStyle w:val="TableContents"/>
+              <w:keepNext w:val="false"/>
+              <w:widowControl/>
+              <w:spacing w:before="0" w:after="0"/>
+              <w:ind w:hanging="0" w:left="0"/>
+              <w:jc w:val="center"/>
+              <w:rPr>
+                <w:rFonts w:ascii="Arial" w:hAnsi="Arial" w:eastAsia="Arial" w:cs="Arial"/>
+                <w:b w:val="false"/>
+                <w:i w:val="false"/>
+                <w:color w:val="auto"/>
+                <w:spacing w:val="0"/>
+                <w:w w:val="100"/>
+                <w:sz w:val="16"/>
+                <w:szCs w:val="16"/>
+                <w:lang w:val="ro-RO"/>
+              </w:rPr>
+            </w:pPr>
+            <w:r>
+              <w:rPr>
+                <w:rFonts w:eastAsia="Arial" w:cs="Arial" w:ascii="Arial" w:hAnsi="Arial"/>
+                <w:b w:val="false"/>
+                <w:i w:val="false"/>
+                <w:color w:val="auto"/>
+                <w:spacing w:val="0"/>
+                <w:w w:val="100"/>
+                <w:sz w:val="16"/>
+                <w:szCs w:val="16"/>
+                <w:lang w:val="ro-RO"/>
+              </w:rPr>
+              <w:t>X</w:t>
+            </w:r>
+          </w:p>
+        </w:tc>
+        <w:tc>
+          <w:tcPr>
+            <w:tcW w:w="400" w:type="dxa"/>
+            <w:tcBorders>
+              <w:left w:val="single" w:sz="4" w:space="0" w:color="000000"/>
+              <w:bottom w:val="single" w:sz="4" w:space="0" w:color="000000"/>
+            </w:tcBorders>
+            <w:vAlign w:val="center"/>
+          </w:tcPr>
+          <w:p>
+            <w:pPr>
+              <w:pStyle w:val="TableContents"/>
+              <w:keepNext w:val="false"/>
+              <w:widowControl/>
+              <w:spacing w:before="0" w:after="0"/>
+              <w:ind w:hanging="0" w:left="0"/>
+              <w:jc w:val="center"/>
+              <w:rPr>
+                <w:rFonts w:ascii="Arial" w:hAnsi="Arial" w:eastAsia="Arial" w:cs="Arial"/>
+                <w:b w:val="false"/>
+                <w:i w:val="false"/>
+                <w:color w:val="auto"/>
+                <w:spacing w:val="0"/>
+                <w:w w:val="100"/>
+                <w:sz w:val="16"/>
+                <w:szCs w:val="16"/>
+                <w:lang w:val="ro-RO"/>
+              </w:rPr>
+            </w:pPr>
+            <w:r>
+              <w:rPr>
+                <w:rFonts w:eastAsia="Arial" w:cs="Arial" w:ascii="Arial" w:hAnsi="Arial"/>
+                <w:b w:val="false"/>
+                <w:i w:val="false"/>
+                <w:color w:val="auto"/>
+                <w:spacing w:val="0"/>
+                <w:w w:val="100"/>
+                <w:sz w:val="16"/>
+                <w:szCs w:val="16"/>
+                <w:lang w:val="ro-RO"/>
+              </w:rPr>
+              <w:t>–</w:t>
+            </w:r>
+          </w:p>
+        </w:tc>
+        <w:tc>
+          <w:tcPr>
+            <w:tcW w:w="398" w:type="dxa"/>
+            <w:tcBorders>
+              <w:left w:val="single" w:sz="4" w:space="0" w:color="000000"/>
+              <w:bottom w:val="single" w:sz="4" w:space="0" w:color="000000"/>
+            </w:tcBorders>
+            <w:vAlign w:val="center"/>
+          </w:tcPr>
+          <w:p>
+            <w:pPr>
+              <w:pStyle w:val="TableContents"/>
+              <w:keepNext w:val="false"/>
+              <w:widowControl/>
+              <w:spacing w:before="0" w:after="0"/>
+              <w:ind w:hanging="0" w:left="0"/>
+              <w:jc w:val="center"/>
+              <w:rPr>
+                <w:rFonts w:ascii="Arial" w:hAnsi="Arial" w:eastAsia="Arial" w:cs="Arial"/>
+                <w:b w:val="false"/>
+                <w:i w:val="false"/>
+                <w:color w:val="auto"/>
+                <w:spacing w:val="0"/>
+                <w:w w:val="100"/>
+                <w:sz w:val="16"/>
+                <w:szCs w:val="16"/>
+                <w:lang w:val="ro-RO"/>
+              </w:rPr>
+            </w:pPr>
+            <w:r>
+              <w:rPr>
+                <w:rFonts w:eastAsia="Arial" w:cs="Arial" w:ascii="Arial" w:hAnsi="Arial"/>
+                <w:b w:val="false"/>
+                <w:i w:val="false"/>
+                <w:color w:val="auto"/>
+                <w:spacing w:val="0"/>
+                <w:w w:val="100"/>
+                <w:sz w:val="16"/>
+                <w:szCs w:val="16"/>
+                <w:lang w:val="ro-RO"/>
+              </w:rPr>
+              <w:t>–</w:t>
+            </w:r>
+          </w:p>
+        </w:tc>
+        <w:tc>
+          <w:tcPr>
+            <w:tcW w:w="400" w:type="dxa"/>
+            <w:tcBorders>
+              <w:left w:val="single" w:sz="4" w:space="0" w:color="000000"/>
+              <w:bottom w:val="single" w:sz="4" w:space="0" w:color="000000"/>
+            </w:tcBorders>
+            <w:vAlign w:val="center"/>
+          </w:tcPr>
+          <w:p>
+            <w:pPr>
+              <w:pStyle w:val="TableContents"/>
+              <w:keepNext w:val="false"/>
+              <w:widowControl/>
+              <w:spacing w:before="0" w:after="0"/>
+              <w:ind w:hanging="0" w:left="0"/>
+              <w:jc w:val="center"/>
+              <w:rPr>
+                <w:rFonts w:ascii="Arial" w:hAnsi="Arial" w:eastAsia="Arial" w:cs="Arial"/>
+                <w:b w:val="false"/>
+                <w:i w:val="false"/>
+                <w:color w:val="auto"/>
+                <w:spacing w:val="0"/>
+                <w:w w:val="100"/>
+                <w:sz w:val="16"/>
+                <w:szCs w:val="16"/>
+                <w:lang w:val="ro-RO"/>
+              </w:rPr>
+            </w:pPr>
+            <w:r>
+              <w:rPr>
+                <w:rFonts w:eastAsia="Arial" w:cs="Arial" w:ascii="Arial" w:hAnsi="Arial"/>
+                <w:b w:val="false"/>
+                <w:i w:val="false"/>
+                <w:color w:val="auto"/>
+                <w:spacing w:val="0"/>
+                <w:w w:val="100"/>
+                <w:sz w:val="16"/>
+                <w:szCs w:val="16"/>
+                <w:lang w:val="ro-RO"/>
+              </w:rPr>
+              <w:t>X</w:t>
+            </w:r>
+          </w:p>
+        </w:tc>
+        <w:tc>
+          <w:tcPr>
+            <w:tcW w:w="398" w:type="dxa"/>
+            <w:tcBorders>
+              <w:left w:val="single" w:sz="4" w:space="0" w:color="000000"/>
+              <w:bottom w:val="single" w:sz="4" w:space="0" w:color="000000"/>
+            </w:tcBorders>
+            <w:vAlign w:val="center"/>
+          </w:tcPr>
+          <w:p>
+            <w:pPr>
+              <w:pStyle w:val="TableContents"/>
+              <w:keepNext w:val="false"/>
+              <w:widowControl/>
+              <w:spacing w:before="0" w:after="0"/>
+              <w:ind w:hanging="0" w:left="0"/>
+              <w:jc w:val="center"/>
+              <w:rPr>
+                <w:rFonts w:ascii="Arial" w:hAnsi="Arial" w:eastAsia="Arial" w:cs="Arial"/>
+                <w:b w:val="false"/>
+                <w:i w:val="false"/>
+                <w:color w:val="auto"/>
+                <w:spacing w:val="0"/>
+                <w:w w:val="100"/>
+                <w:sz w:val="16"/>
+                <w:szCs w:val="16"/>
+                <w:lang w:val="ro-RO"/>
+              </w:rPr>
+            </w:pPr>
+            <w:r>
+              <w:rPr>
+                <w:rFonts w:eastAsia="Arial" w:cs="Arial" w:ascii="Arial" w:hAnsi="Arial"/>
+                <w:b w:val="false"/>
+                <w:i w:val="false"/>
+                <w:color w:val="auto"/>
+                <w:spacing w:val="0"/>
+                <w:w w:val="100"/>
+                <w:sz w:val="16"/>
+                <w:szCs w:val="16"/>
+                <w:lang w:val="ro-RO"/>
+              </w:rPr>
+              <w:t>–</w:t>
+            </w:r>
+          </w:p>
+        </w:tc>
+        <w:tc>
+          <w:tcPr>
+            <w:tcW w:w="400" w:type="dxa"/>
+            <w:tcBorders>
+              <w:left w:val="single" w:sz="4" w:space="0" w:color="000000"/>
+              <w:bottom w:val="single" w:sz="4" w:space="0" w:color="000000"/>
+            </w:tcBorders>
+            <w:vAlign w:val="center"/>
+          </w:tcPr>
+          <w:p>
+            <w:pPr>
+              <w:pStyle w:val="TableContents"/>
+              <w:keepNext w:val="false"/>
+              <w:widowControl/>
+              <w:spacing w:before="0" w:after="0"/>
+              <w:ind w:hanging="0" w:left="0"/>
+              <w:jc w:val="center"/>
+              <w:rPr>
+                <w:rFonts w:ascii="Arial" w:hAnsi="Arial" w:eastAsia="Arial" w:cs="Arial"/>
+                <w:b w:val="false"/>
+                <w:i w:val="false"/>
+                <w:color w:val="auto"/>
+                <w:spacing w:val="0"/>
+                <w:w w:val="100"/>
+                <w:sz w:val="16"/>
+                <w:szCs w:val="16"/>
+                <w:lang w:val="ro-RO"/>
+              </w:rPr>
+            </w:pPr>
+            <w:r>
+              <w:rPr>
+                <w:rFonts w:eastAsia="Arial" w:cs="Arial" w:ascii="Arial" w:hAnsi="Arial"/>
+                <w:b w:val="false"/>
+                <w:i w:val="false"/>
+                <w:color w:val="auto"/>
+                <w:spacing w:val="0"/>
+                <w:w w:val="100"/>
+                <w:sz w:val="16"/>
+                <w:szCs w:val="16"/>
+                <w:lang w:val="ro-RO"/>
+              </w:rPr>
+              <w:t>–</w:t>
+            </w:r>
+          </w:p>
+        </w:tc>
+        <w:tc>
+          <w:tcPr>
+            <w:tcW w:w="399" w:type="dxa"/>
+            <w:tcBorders>
+              <w:left w:val="single" w:sz="4" w:space="0" w:color="000000"/>
+              <w:bottom w:val="single" w:sz="4" w:space="0" w:color="000000"/>
+              <w:right w:val="single" w:sz="4" w:space="0" w:color="000000"/>
+            </w:tcBorders>
+            <w:vAlign w:val="center"/>
+          </w:tcPr>
+          <w:p>
+            <w:pPr>
+              <w:pStyle w:val="TableContents"/>
+              <w:keepNext w:val="false"/>
+              <w:widowControl/>
+              <w:spacing w:before="0" w:after="0"/>
+              <w:ind w:hanging="0" w:left="0"/>
+              <w:jc w:val="center"/>
+              <w:rPr>
+                <w:rFonts w:ascii="Arial" w:hAnsi="Arial" w:eastAsia="Arial" w:cs="Arial"/>
+                <w:b w:val="false"/>
+                <w:i w:val="false"/>
+                <w:color w:val="auto"/>
+                <w:spacing w:val="0"/>
+                <w:w w:val="100"/>
+                <w:sz w:val="16"/>
+                <w:szCs w:val="16"/>
+                <w:lang w:val="ro-RO"/>
+              </w:rPr>
+            </w:pPr>
+            <w:r>
+              <w:rPr>
+                <w:rFonts w:eastAsia="Arial" w:cs="Arial" w:ascii="Arial" w:hAnsi="Arial"/>
+                <w:b w:val="false"/>
+                <w:i w:val="false"/>
+                <w:color w:val="auto"/>
+                <w:spacing w:val="0"/>
+                <w:w w:val="100"/>
+                <w:sz w:val="16"/>
+                <w:szCs w:val="16"/>
+                <w:lang w:val="ro-RO"/>
+              </w:rPr>
+              <w:t>X{{/fire.hasThirdParties}}</w:t>
             </w:r>
           </w:p>
         </w:tc>

</xml_diff>